<commit_message>
generate html resume as well
</commit_message>
<xml_diff>
--- a/output/Career-Summary.docx
+++ b/output/Career-Summary.docx
@@ -86,7 +86,6 @@
     </w:p>
     <w:p>
       <w:pPr>
-        <w:pStyle w:val="Compact"/>
         <w:pStyle w:val="Definition"/>
       </w:pPr>
       <w:r>
@@ -138,12 +137,11 @@
     </w:p>
     <w:p>
       <w:pPr>
-        <w:pStyle w:val="Compact"/>
-        <w:pStyle w:val="Definition"/>
-        <w:numPr>
+        <w:numPr>
+          <w:ilvl w:val="0"/>
           <w:numId w:val="1001"/>
-          <w:ilvl w:val="0"/>
-        </w:numPr>
+        </w:numPr>
+        <w:pStyle w:val="Definition"/>
       </w:pPr>
       <w:r>
         <w:t xml:space="preserve">Implemented an Enterprise level observability stack.</w:t>
@@ -151,12 +149,11 @@
     </w:p>
     <w:p>
       <w:pPr>
-        <w:pStyle w:val="Compact"/>
-        <w:pStyle w:val="Definition"/>
-        <w:numPr>
+        <w:numPr>
+          <w:ilvl w:val="0"/>
           <w:numId w:val="1001"/>
-          <w:ilvl w:val="0"/>
-        </w:numPr>
+        </w:numPr>
+        <w:pStyle w:val="Definition"/>
       </w:pPr>
       <w:r>
         <w:t xml:space="preserve">Creation and deployment of Helm charts on the cloud.</w:t>
@@ -164,12 +161,11 @@
     </w:p>
     <w:p>
       <w:pPr>
-        <w:pStyle w:val="Compact"/>
-        <w:pStyle w:val="Definition"/>
-        <w:numPr>
+        <w:numPr>
+          <w:ilvl w:val="0"/>
           <w:numId w:val="1001"/>
-          <w:ilvl w:val="0"/>
-        </w:numPr>
+        </w:numPr>
+        <w:pStyle w:val="Definition"/>
       </w:pPr>
       <w:r>
         <w:t xml:space="preserve">Creation, deployment, and management of Kubernetes manifests.</w:t>
@@ -177,12 +173,11 @@
     </w:p>
     <w:p>
       <w:pPr>
-        <w:pStyle w:val="Compact"/>
-        <w:pStyle w:val="Definition"/>
-        <w:numPr>
+        <w:numPr>
+          <w:ilvl w:val="0"/>
           <w:numId w:val="1001"/>
-          <w:ilvl w:val="0"/>
-        </w:numPr>
+        </w:numPr>
+        <w:pStyle w:val="Definition"/>
       </w:pPr>
       <w:r>
         <w:t xml:space="preserve">Worked on end-to-end logging stack setup in EFFK(Elastic search-Fluentd-Fluentbit-Kibana) fashion.</w:t>
@@ -190,12 +185,11 @@
     </w:p>
     <w:p>
       <w:pPr>
-        <w:pStyle w:val="Compact"/>
-        <w:pStyle w:val="Definition"/>
-        <w:numPr>
+        <w:numPr>
+          <w:ilvl w:val="0"/>
           <w:numId w:val="1001"/>
-          <w:ilvl w:val="0"/>
-        </w:numPr>
+        </w:numPr>
+        <w:pStyle w:val="Definition"/>
       </w:pPr>
       <w:r>
         <w:t xml:space="preserve">Implementation and POC’s of Distributed Tracing stack using Open-tracing specifications and Jaeger as backend. (Some exploration on Open-telemetry as well)</w:t>
@@ -203,12 +197,11 @@
     </w:p>
     <w:p>
       <w:pPr>
-        <w:pStyle w:val="Compact"/>
-        <w:pStyle w:val="Definition"/>
-        <w:numPr>
+        <w:numPr>
+          <w:ilvl w:val="0"/>
           <w:numId w:val="1001"/>
-          <w:ilvl w:val="0"/>
-        </w:numPr>
+        </w:numPr>
+        <w:pStyle w:val="Definition"/>
       </w:pPr>
       <w:r>
         <w:t xml:space="preserve">POC’s on Terraform across multi-clouds.</w:t>
@@ -227,7 +220,6 @@
     </w:p>
     <w:p>
       <w:pPr>
-        <w:pStyle w:val="Compact"/>
         <w:pStyle w:val="Definition"/>
       </w:pPr>
       <w:r>
@@ -279,12 +271,11 @@
     </w:p>
     <w:p>
       <w:pPr>
-        <w:pStyle w:val="Compact"/>
-        <w:pStyle w:val="Definition"/>
-        <w:numPr>
+        <w:numPr>
+          <w:ilvl w:val="0"/>
           <w:numId w:val="1002"/>
-          <w:ilvl w:val="0"/>
-        </w:numPr>
+        </w:numPr>
+        <w:pStyle w:val="Definition"/>
       </w:pPr>
       <w:r>
         <w:t xml:space="preserve">Worked as an Architect from Automation perspectives to help Database Kernel Engineers’ teams.</w:t>
@@ -292,12 +283,11 @@
     </w:p>
     <w:p>
       <w:pPr>
-        <w:pStyle w:val="Compact"/>
-        <w:pStyle w:val="Definition"/>
-        <w:numPr>
+        <w:numPr>
+          <w:ilvl w:val="0"/>
           <w:numId w:val="1002"/>
-          <w:ilvl w:val="0"/>
-        </w:numPr>
+        </w:numPr>
+        <w:pStyle w:val="Definition"/>
       </w:pPr>
       <w:r>
         <w:t xml:space="preserve">Implemented a complete CI/CD solution for DBaaS solution from scratch in ConcourseCI.</w:t>
@@ -305,12 +295,11 @@
     </w:p>
     <w:p>
       <w:pPr>
-        <w:pStyle w:val="Compact"/>
-        <w:pStyle w:val="Definition"/>
-        <w:numPr>
+        <w:numPr>
+          <w:ilvl w:val="0"/>
           <w:numId w:val="1002"/>
-          <w:ilvl w:val="0"/>
-        </w:numPr>
+        </w:numPr>
+        <w:pStyle w:val="Definition"/>
       </w:pPr>
       <w:r>
         <w:t xml:space="preserve">Enabled the teams in Artefacts management and Deployment on Kubernetes.</w:t>
@@ -318,12 +307,11 @@
     </w:p>
     <w:p>
       <w:pPr>
-        <w:pStyle w:val="Compact"/>
-        <w:pStyle w:val="Definition"/>
-        <w:numPr>
+        <w:numPr>
+          <w:ilvl w:val="0"/>
           <w:numId w:val="1002"/>
-          <w:ilvl w:val="0"/>
-        </w:numPr>
+        </w:numPr>
+        <w:pStyle w:val="Definition"/>
       </w:pPr>
       <w:r>
         <w:t xml:space="preserve">Creation, installation, and management of RPM’s, Docker Images stored in Artifactory.</w:t>
@@ -359,7 +347,6 @@
     </w:p>
     <w:p>
       <w:pPr>
-        <w:pStyle w:val="Compact"/>
         <w:pStyle w:val="Definition"/>
       </w:pPr>
       <w:r>
@@ -411,12 +398,11 @@
     </w:p>
     <w:p>
       <w:pPr>
-        <w:pStyle w:val="Compact"/>
-        <w:pStyle w:val="Definition"/>
-        <w:numPr>
+        <w:numPr>
+          <w:ilvl w:val="0"/>
           <w:numId w:val="1003"/>
-          <w:ilvl w:val="0"/>
-        </w:numPr>
+        </w:numPr>
+        <w:pStyle w:val="Definition"/>
       </w:pPr>
       <w:r>
         <w:t xml:space="preserve">Provisioning complete Infrastructure using Terraform on AWS.</w:t>
@@ -424,12 +410,11 @@
     </w:p>
     <w:p>
       <w:pPr>
-        <w:pStyle w:val="Compact"/>
-        <w:pStyle w:val="Definition"/>
-        <w:numPr>
+        <w:numPr>
+          <w:ilvl w:val="0"/>
           <w:numId w:val="1003"/>
-          <w:ilvl w:val="0"/>
-        </w:numPr>
+        </w:numPr>
+        <w:pStyle w:val="Definition"/>
       </w:pPr>
       <w:r>
         <w:t xml:space="preserve">Participating in Architectural decisions at Infra level.</w:t>
@@ -437,12 +422,11 @@
     </w:p>
     <w:p>
       <w:pPr>
-        <w:pStyle w:val="Compact"/>
-        <w:pStyle w:val="Definition"/>
-        <w:numPr>
+        <w:numPr>
+          <w:ilvl w:val="0"/>
           <w:numId w:val="1003"/>
-          <w:ilvl w:val="0"/>
-        </w:numPr>
+        </w:numPr>
+        <w:pStyle w:val="Definition"/>
       </w:pPr>
       <w:r>
         <w:t xml:space="preserve">Helping other teams in Infrastructure queries and conducting knowledge transfer sessions.</w:t>
@@ -450,12 +434,11 @@
     </w:p>
     <w:p>
       <w:pPr>
-        <w:pStyle w:val="Compact"/>
-        <w:pStyle w:val="Definition"/>
-        <w:numPr>
+        <w:numPr>
+          <w:ilvl w:val="0"/>
           <w:numId w:val="1003"/>
-          <w:ilvl w:val="0"/>
-        </w:numPr>
+        </w:numPr>
+        <w:pStyle w:val="Definition"/>
       </w:pPr>
       <w:r>
         <w:t xml:space="preserve">Writing and maintaining containerized code/practices using Docker as a tool.</w:t>
@@ -463,12 +446,11 @@
     </w:p>
     <w:p>
       <w:pPr>
-        <w:pStyle w:val="Compact"/>
-        <w:pStyle w:val="Definition"/>
-        <w:numPr>
+        <w:numPr>
+          <w:ilvl w:val="0"/>
           <w:numId w:val="1003"/>
-          <w:ilvl w:val="0"/>
-        </w:numPr>
+        </w:numPr>
+        <w:pStyle w:val="Definition"/>
       </w:pPr>
       <w:r>
         <w:t xml:space="preserve">Securing Application on the cloud.</w:t>
@@ -476,12 +458,11 @@
     </w:p>
     <w:p>
       <w:pPr>
-        <w:pStyle w:val="Compact"/>
-        <w:pStyle w:val="Definition"/>
-        <w:numPr>
+        <w:numPr>
+          <w:ilvl w:val="0"/>
           <w:numId w:val="1003"/>
-          <w:ilvl w:val="0"/>
-        </w:numPr>
+        </w:numPr>
+        <w:pStyle w:val="Definition"/>
       </w:pPr>
       <w:r>
         <w:t xml:space="preserve">Writing Ansible scripts to provision/configure our Infrastructure.</w:t>
@@ -489,12 +470,11 @@
     </w:p>
     <w:p>
       <w:pPr>
-        <w:pStyle w:val="Compact"/>
-        <w:pStyle w:val="Definition"/>
-        <w:numPr>
+        <w:numPr>
+          <w:ilvl w:val="0"/>
           <w:numId w:val="1003"/>
-          <w:ilvl w:val="0"/>
-        </w:numPr>
+        </w:numPr>
+        <w:pStyle w:val="Definition"/>
       </w:pPr>
       <w:r>
         <w:t xml:space="preserve">Implementing an observability system for better visibility of Environments.</w:t>
@@ -502,12 +482,11 @@
     </w:p>
     <w:p>
       <w:pPr>
-        <w:pStyle w:val="Compact"/>
-        <w:pStyle w:val="Definition"/>
-        <w:numPr>
+        <w:numPr>
+          <w:ilvl w:val="0"/>
           <w:numId w:val="1003"/>
-          <w:ilvl w:val="0"/>
-        </w:numPr>
+        </w:numPr>
+        <w:pStyle w:val="Definition"/>
       </w:pPr>
       <w:r>
         <w:t xml:space="preserve">End-to-end implementation and management of CI/CD automated using YAML, Ruby, Rake on ConcourseCI.</w:t>
@@ -558,12 +537,11 @@
     </w:p>
     <w:p>
       <w:pPr>
-        <w:pStyle w:val="Compact"/>
-        <w:pStyle w:val="Definition"/>
-        <w:numPr>
+        <w:numPr>
+          <w:ilvl w:val="0"/>
           <w:numId w:val="1004"/>
-          <w:ilvl w:val="0"/>
-        </w:numPr>
+        </w:numPr>
+        <w:pStyle w:val="Definition"/>
       </w:pPr>
       <w:r>
         <w:t xml:space="preserve">Implementation of backend and helping other team members in Ramping up.</w:t>
@@ -571,12 +549,11 @@
     </w:p>
     <w:p>
       <w:pPr>
-        <w:pStyle w:val="Compact"/>
-        <w:pStyle w:val="Definition"/>
-        <w:numPr>
+        <w:numPr>
+          <w:ilvl w:val="0"/>
           <w:numId w:val="1004"/>
-          <w:ilvl w:val="0"/>
-        </w:numPr>
+        </w:numPr>
+        <w:pStyle w:val="Definition"/>
       </w:pPr>
       <w:r>
         <w:t xml:space="preserve">Setup of complete email notification system for the Application from scratch along with testing and deployment.</w:t>
@@ -584,12 +561,11 @@
     </w:p>
     <w:p>
       <w:pPr>
-        <w:pStyle w:val="Compact"/>
-        <w:pStyle w:val="Definition"/>
-        <w:numPr>
+        <w:numPr>
+          <w:ilvl w:val="0"/>
           <w:numId w:val="1004"/>
-          <w:ilvl w:val="0"/>
-        </w:numPr>
+        </w:numPr>
+        <w:pStyle w:val="Definition"/>
       </w:pPr>
       <w:r>
         <w:t xml:space="preserve">Automating Spring batch jobs for regular tasks.</w:t>
@@ -640,12 +616,11 @@
     </w:p>
     <w:p>
       <w:pPr>
-        <w:pStyle w:val="Compact"/>
-        <w:pStyle w:val="Definition"/>
-        <w:numPr>
+        <w:numPr>
+          <w:ilvl w:val="0"/>
           <w:numId w:val="1005"/>
-          <w:ilvl w:val="0"/>
-        </w:numPr>
+        </w:numPr>
+        <w:pStyle w:val="Definition"/>
       </w:pPr>
       <w:r>
         <w:t xml:space="preserve">Leading DevOps efforts.</w:t>
@@ -653,12 +628,11 @@
     </w:p>
     <w:p>
       <w:pPr>
-        <w:pStyle w:val="Compact"/>
-        <w:pStyle w:val="Definition"/>
-        <w:numPr>
+        <w:numPr>
+          <w:ilvl w:val="0"/>
           <w:numId w:val="1005"/>
-          <w:ilvl w:val="0"/>
-        </w:numPr>
+        </w:numPr>
+        <w:pStyle w:val="Definition"/>
       </w:pPr>
       <w:r>
         <w:t xml:space="preserve">Writing and automating infrastructure code using Docker, Terraform.</w:t>
@@ -666,12 +640,11 @@
     </w:p>
     <w:p>
       <w:pPr>
-        <w:pStyle w:val="Compact"/>
-        <w:pStyle w:val="Definition"/>
-        <w:numPr>
+        <w:numPr>
+          <w:ilvl w:val="0"/>
           <w:numId w:val="1005"/>
-          <w:ilvl w:val="0"/>
-        </w:numPr>
+        </w:numPr>
+        <w:pStyle w:val="Definition"/>
       </w:pPr>
       <w:r>
         <w:t xml:space="preserve">Automating CI/CD setup from scratch.</w:t>
@@ -679,12 +652,11 @@
     </w:p>
     <w:p>
       <w:pPr>
-        <w:pStyle w:val="Compact"/>
-        <w:pStyle w:val="Definition"/>
-        <w:numPr>
+        <w:numPr>
+          <w:ilvl w:val="0"/>
           <w:numId w:val="1005"/>
-          <w:ilvl w:val="0"/>
-        </w:numPr>
+        </w:numPr>
+        <w:pStyle w:val="Definition"/>
       </w:pPr>
       <w:r>
         <w:t xml:space="preserve">Maintaining and Monitoring Production Environments.</w:t>
@@ -692,12 +664,11 @@
     </w:p>
     <w:p>
       <w:pPr>
-        <w:pStyle w:val="Compact"/>
-        <w:pStyle w:val="Definition"/>
-        <w:numPr>
+        <w:numPr>
+          <w:ilvl w:val="0"/>
           <w:numId w:val="1005"/>
-          <w:ilvl w:val="0"/>
-        </w:numPr>
+        </w:numPr>
+        <w:pStyle w:val="Definition"/>
       </w:pPr>
       <w:r>
         <w:t xml:space="preserve">Helping Application development team in infrastructure issues/queries.</w:t>
@@ -748,12 +719,11 @@
     </w:p>
     <w:p>
       <w:pPr>
-        <w:pStyle w:val="Compact"/>
-        <w:pStyle w:val="Definition"/>
-        <w:numPr>
+        <w:numPr>
+          <w:ilvl w:val="0"/>
           <w:numId w:val="1006"/>
-          <w:ilvl w:val="0"/>
-        </w:numPr>
+        </w:numPr>
+        <w:pStyle w:val="Definition"/>
       </w:pPr>
       <w:r>
         <w:t xml:space="preserve">Understanding and analyzing business requirements.</w:t>
@@ -761,12 +731,11 @@
     </w:p>
     <w:p>
       <w:pPr>
-        <w:pStyle w:val="Compact"/>
-        <w:pStyle w:val="Definition"/>
-        <w:numPr>
+        <w:numPr>
+          <w:ilvl w:val="0"/>
           <w:numId w:val="1006"/>
-          <w:ilvl w:val="0"/>
-        </w:numPr>
+        </w:numPr>
+        <w:pStyle w:val="Definition"/>
       </w:pPr>
       <w:r>
         <w:t xml:space="preserve">Upgrading the existing stack. (It was 4-5 years old)</w:t>
@@ -774,12 +743,11 @@
     </w:p>
     <w:p>
       <w:pPr>
-        <w:pStyle w:val="Compact"/>
-        <w:pStyle w:val="Definition"/>
-        <w:numPr>
+        <w:numPr>
+          <w:ilvl w:val="0"/>
           <w:numId w:val="1006"/>
-          <w:ilvl w:val="0"/>
-        </w:numPr>
+        </w:numPr>
+        <w:pStyle w:val="Definition"/>
       </w:pPr>
       <w:r>
         <w:t xml:space="preserve">Writing and fixing Application code and all testing phases, including unit, integration, acceptance tests.</w:t>
@@ -787,12 +755,11 @@
     </w:p>
     <w:p>
       <w:pPr>
-        <w:pStyle w:val="Compact"/>
-        <w:pStyle w:val="Definition"/>
-        <w:numPr>
+        <w:numPr>
+          <w:ilvl w:val="0"/>
           <w:numId w:val="1006"/>
-          <w:ilvl w:val="0"/>
-        </w:numPr>
+        </w:numPr>
+        <w:pStyle w:val="Definition"/>
       </w:pPr>
       <w:r>
         <w:t xml:space="preserve">Deploying the Application on Heroku.</w:t>
@@ -800,12 +767,11 @@
     </w:p>
     <w:p>
       <w:pPr>
-        <w:pStyle w:val="Compact"/>
-        <w:pStyle w:val="Definition"/>
-        <w:numPr>
+        <w:numPr>
+          <w:ilvl w:val="0"/>
           <w:numId w:val="1006"/>
-          <w:ilvl w:val="0"/>
-        </w:numPr>
+        </w:numPr>
+        <w:pStyle w:val="Definition"/>
       </w:pPr>
       <w:r>
         <w:t xml:space="preserve">Integrate the Application with circle CI.</w:t>
@@ -870,12 +836,11 @@
     </w:p>
     <w:p>
       <w:pPr>
-        <w:pStyle w:val="Compact"/>
-        <w:pStyle w:val="Definition"/>
-        <w:numPr>
+        <w:numPr>
+          <w:ilvl w:val="0"/>
           <w:numId w:val="1007"/>
-          <w:ilvl w:val="0"/>
-        </w:numPr>
+        </w:numPr>
+        <w:pStyle w:val="Definition"/>
       </w:pPr>
       <w:r>
         <w:t xml:space="preserve">Learn and implement design principles, design patterns in an Application.</w:t>
@@ -883,12 +848,11 @@
     </w:p>
     <w:p>
       <w:pPr>
-        <w:pStyle w:val="Compact"/>
-        <w:pStyle w:val="Definition"/>
-        <w:numPr>
+        <w:numPr>
+          <w:ilvl w:val="0"/>
           <w:numId w:val="1007"/>
-          <w:ilvl w:val="0"/>
-        </w:numPr>
+        </w:numPr>
+        <w:pStyle w:val="Definition"/>
       </w:pPr>
       <w:r>
         <w:t xml:space="preserve">Writing clean code.</w:t>
@@ -896,12 +860,11 @@
     </w:p>
     <w:p>
       <w:pPr>
-        <w:pStyle w:val="Compact"/>
-        <w:pStyle w:val="Definition"/>
-        <w:numPr>
+        <w:numPr>
+          <w:ilvl w:val="0"/>
           <w:numId w:val="1007"/>
-          <w:ilvl w:val="0"/>
-        </w:numPr>
+        </w:numPr>
+        <w:pStyle w:val="Definition"/>
       </w:pPr>
       <w:r>
         <w:t xml:space="preserve">Learn and understand the impact of Agile, TDD, Automation, CI/CD, Teamwork in a Project.</w:t>
@@ -952,12 +915,11 @@
     </w:p>
     <w:p>
       <w:pPr>
-        <w:pStyle w:val="Compact"/>
-        <w:pStyle w:val="Definition"/>
-        <w:numPr>
+        <w:numPr>
+          <w:ilvl w:val="0"/>
           <w:numId w:val="1008"/>
-          <w:ilvl w:val="0"/>
-        </w:numPr>
+        </w:numPr>
+        <w:pStyle w:val="Definition"/>
       </w:pPr>
       <w:r>
         <w:t xml:space="preserve">Writing and updating the Acceptance test suite.</w:t>
@@ -965,12 +927,11 @@
     </w:p>
     <w:p>
       <w:pPr>
-        <w:pStyle w:val="Compact"/>
-        <w:pStyle w:val="Definition"/>
-        <w:numPr>
+        <w:numPr>
+          <w:ilvl w:val="0"/>
           <w:numId w:val="1008"/>
-          <w:ilvl w:val="0"/>
-        </w:numPr>
+        </w:numPr>
+        <w:pStyle w:val="Definition"/>
       </w:pPr>
       <w:r>
         <w:t xml:space="preserve">Worked on writing Java for backend implementation.</w:t>
@@ -1021,12 +982,11 @@
     </w:p>
     <w:p>
       <w:pPr>
-        <w:pStyle w:val="Compact"/>
-        <w:pStyle w:val="Definition"/>
-        <w:numPr>
+        <w:numPr>
+          <w:ilvl w:val="0"/>
           <w:numId w:val="1009"/>
-          <w:ilvl w:val="0"/>
-        </w:numPr>
+        </w:numPr>
+        <w:pStyle w:val="Definition"/>
       </w:pPr>
       <w:r>
         <w:t xml:space="preserve">Writing Backend code for the Applications using Ruby on Rails.</w:t>
@@ -1034,12 +994,11 @@
     </w:p>
     <w:p>
       <w:pPr>
-        <w:pStyle w:val="Compact"/>
-        <w:pStyle w:val="Definition"/>
-        <w:numPr>
+        <w:numPr>
+          <w:ilvl w:val="0"/>
           <w:numId w:val="1009"/>
-          <w:ilvl w:val="0"/>
-        </w:numPr>
+        </w:numPr>
+        <w:pStyle w:val="Definition"/>
       </w:pPr>
       <w:r>
         <w:t xml:space="preserve">Writing Unit/Integration/UI tests to ensure code quality.</w:t>
@@ -1047,12 +1006,11 @@
     </w:p>
     <w:p>
       <w:pPr>
-        <w:pStyle w:val="Compact"/>
-        <w:pStyle w:val="Definition"/>
-        <w:numPr>
+        <w:numPr>
+          <w:ilvl w:val="0"/>
           <w:numId w:val="1009"/>
-          <w:ilvl w:val="0"/>
-        </w:numPr>
+        </w:numPr>
+        <w:pStyle w:val="Definition"/>
       </w:pPr>
       <w:r>
         <w:t xml:space="preserve">Automating CI/CD (GOCD) environment to integrate code and one-click deployments.</w:t>
@@ -1071,7 +1029,6 @@
     </w:p>
     <w:p>
       <w:pPr>
-        <w:pStyle w:val="Compact"/>
         <w:pStyle w:val="Definition"/>
       </w:pPr>
       <w:r>
@@ -1121,7 +1078,7 @@
         <w:t xml:space="preserve">• +91-9803972479 • Senior DevOps Engineer</w:t>
       </w:r>
       <w:r>
-        <w:br w:type="textWrapping"/>
+        <w:br/>
       </w:r>
       <w:hyperlink r:id="rId27">
         <w:r>
@@ -1135,7 +1092,7 @@
         <w:t xml:space="preserve">: https://www.linkedin.com/in/amiedeep/</w:t>
       </w:r>
       <w:r>
-        <w:br w:type="textWrapping"/>
+        <w:br/>
       </w:r>
       <w:hyperlink r:id="rId27">
         <w:r>
@@ -1149,7 +1106,7 @@
         <w:t xml:space="preserve">: https://github.com/Amiedeep</w:t>
       </w:r>
       <w:r>
-        <w:br w:type="textWrapping"/>
+        <w:br/>
       </w:r>
       <w:r>
         <w:t xml:space="preserve">Bangalore, India</w:t>
@@ -1186,109 +1143,6 @@
 <file path=word/numbering.xml><?xml version="1.0" encoding="utf-8"?>
 <w:numbering xmlns:w="http://schemas.openxmlformats.org/wordprocessingml/2006/main">
   <w:abstractNum w:abstractNumId="990">
-    <w:nsid w:val="170cd2de"/>
-    <w:multiLevelType w:val="multilevel"/>
-    <w:lvl w:ilvl="0">
-      <w:numFmt w:val="bullet"/>
-      <w:lvlText w:val=" "/>
-      <w:lvlJc w:val="left"/>
-      <w:pPr>
-        <w:tabs>
-          <w:tab w:val="num" w:pos="0"/>
-        </w:tabs>
-        <w:ind w:left="480" w:hanging="480"/>
-      </w:pPr>
-    </w:lvl>
-    <w:lvl w:ilvl="1">
-      <w:numFmt w:val="bullet"/>
-      <w:lvlText w:val=" "/>
-      <w:lvlJc w:val="left"/>
-      <w:pPr>
-        <w:tabs>
-          <w:tab w:val="num" w:pos="720"/>
-        </w:tabs>
-        <w:ind w:left="1200" w:hanging="480"/>
-      </w:pPr>
-    </w:lvl>
-    <w:lvl w:ilvl="2">
-      <w:numFmt w:val="bullet"/>
-      <w:lvlText w:val=" "/>
-      <w:lvlJc w:val="left"/>
-      <w:pPr>
-        <w:tabs>
-          <w:tab w:val="num" w:pos="1440"/>
-        </w:tabs>
-        <w:ind w:left="1920" w:hanging="480"/>
-      </w:pPr>
-    </w:lvl>
-    <w:lvl w:ilvl="3">
-      <w:numFmt w:val="bullet"/>
-      <w:lvlText w:val=" "/>
-      <w:lvlJc w:val="left"/>
-      <w:pPr>
-        <w:tabs>
-          <w:tab w:val="num" w:pos="2160"/>
-        </w:tabs>
-        <w:ind w:left="2640" w:hanging="480"/>
-      </w:pPr>
-    </w:lvl>
-    <w:lvl w:ilvl="4">
-      <w:numFmt w:val="bullet"/>
-      <w:lvlText w:val=" "/>
-      <w:lvlJc w:val="left"/>
-      <w:pPr>
-        <w:tabs>
-          <w:tab w:val="num" w:pos="2880"/>
-        </w:tabs>
-        <w:ind w:left="3360" w:hanging="480"/>
-      </w:pPr>
-    </w:lvl>
-    <w:lvl w:ilvl="5">
-      <w:numFmt w:val="bullet"/>
-      <w:lvlText w:val=" "/>
-      <w:lvlJc w:val="left"/>
-      <w:pPr>
-        <w:tabs>
-          <w:tab w:val="num" w:pos="3600"/>
-        </w:tabs>
-        <w:ind w:left="4080" w:hanging="480"/>
-      </w:pPr>
-    </w:lvl>
-    <w:lvl w:ilvl="6">
-      <w:numFmt w:val="bullet"/>
-      <w:lvlText w:val=" "/>
-      <w:lvlJc w:val="left"/>
-      <w:pPr>
-        <w:tabs>
-          <w:tab w:val="num" w:pos="4320"/>
-        </w:tabs>
-        <w:ind w:left="4800" w:hanging="480"/>
-      </w:pPr>
-    </w:lvl>
-    <w:lvl w:ilvl="7">
-      <w:numFmt w:val="bullet"/>
-      <w:lvlText w:val=" "/>
-      <w:lvlJc w:val="left"/>
-      <w:pPr>
-        <w:tabs>
-          <w:tab w:val="num" w:pos="5040"/>
-        </w:tabs>
-        <w:ind w:left="5520" w:hanging="480"/>
-      </w:pPr>
-    </w:lvl>
-    <w:lvl w:ilvl="8">
-      <w:numFmt w:val="bullet"/>
-      <w:lvlText w:val=" "/>
-      <w:lvlJc w:val="left"/>
-      <w:pPr>
-        <w:tabs>
-          <w:tab w:val="num" w:pos="5760"/>
-        </w:tabs>
-        <w:ind w:left="6240" w:hanging="480"/>
-      </w:pPr>
-    </w:lvl>
-  </w:abstractNum>
-  <w:abstractNum w:abstractNumId="990">
     <w:nsid w:val="2c1ae401"/>
     <w:multiLevelType w:val="multilevel"/>
     <w:lvl w:ilvl="0">
@@ -1494,9 +1348,6 @@
       </w:pPr>
     </w:lvl>
   </w:abstractNum>
-  <w:num w:numId="1000">
-    <w:abstractNumId w:val="990"/>
-  </w:num>
   <w:num w:numId="1000">
     <w:abstractNumId w:val="990"/>
   </w:num>
@@ -1670,7 +1521,7 @@
       <w:rFonts w:asciiTheme="majorHAnsi" w:eastAsiaTheme="majorEastAsia" w:hAnsiTheme="majorHAnsi" w:cstheme="majorBidi"/>
       <w:b/>
       <w:bCs/>
-      <w:color w:val="345A8A" w:themeColor="accent1" w:themeShade="B5"/>
+      <w:color w:val="4F81BD" w:themeColor="accent1"/>
       <w:sz w:val="32"/>
       <w:szCs w:val="32"/>
     </w:rPr>
@@ -1693,8 +1544,8 @@
       <w:b/>
       <w:bCs/>
       <w:color w:val="4F81BD" w:themeColor="accent1"/>
-      <w:sz w:val="32"/>
-      <w:szCs w:val="32"/>
+      <w:sz w:val="28"/>
+      <w:szCs w:val="28"/>
     </w:rPr>
   </w:style>
   <w:style w:type="paragraph" w:styleId="Heading3">
@@ -1715,8 +1566,8 @@
       <w:b/>
       <w:bCs/>
       <w:color w:val="4F81BD" w:themeColor="accent1"/>
-      <w:sz w:val="28"/>
-      <w:szCs w:val="28"/>
+      <w:sz w:val="24"/>
+      <w:szCs w:val="24"/>
     </w:rPr>
   </w:style>
   <w:style w:type="paragraph" w:styleId="Heading4">
@@ -1734,7 +1585,7 @@
     </w:pPr>
     <w:rPr>
       <w:rFonts w:asciiTheme="majorHAnsi" w:eastAsiaTheme="majorEastAsia" w:hAnsiTheme="majorHAnsi" w:cstheme="majorBidi"/>
-      <w:b/>
+      <w:i/>
       <w:bCs/>
       <w:color w:val="4F81BD" w:themeColor="accent1"/>
       <w:sz w:val="24"/>
@@ -1756,7 +1607,6 @@
     </w:pPr>
     <w:rPr>
       <w:rFonts w:asciiTheme="majorHAnsi" w:eastAsiaTheme="majorEastAsia" w:hAnsiTheme="majorHAnsi" w:cstheme="majorBidi"/>
-      <w:i/>
       <w:iCs/>
       <w:color w:val="4F81BD" w:themeColor="accent1"/>
       <w:sz w:val="24"/>
@@ -1852,14 +1702,8 @@
     <w:qFormat/>
     <w:pPr>
       <w:spacing w:before="100" w:after="100"/>
-      <w:ind w:firstLine="0"/>
+      <w:ind w:firstLine="0" w:left="480" w:right="480"/>
     </w:pPr>
-    <w:rPr>
-      <w:rFonts w:asciiTheme="majorHAnsi" w:eastAsiaTheme="majorEastAsia" w:hAnsiTheme="majorHAnsi" w:cstheme="majorBidi"/>
-      <w:bCs/>
-      <w:sz w:val="20"/>
-      <w:szCs w:val="20"/>
-    </w:rPr>
   </w:style>
   <w:style w:type="paragraph" w:styleId="FootnoteText">
     <w:name w:val="Footnote Text"/>

</xml_diff>